<commit_message>
Embed initial VS Code screenshots into Task 8 Word report document
</commit_message>
<xml_diff>
--- a/Portfolio WP2/8_Unjuk_Kerja Menerapkan Akses Basis Data - Nugraha Jody.docx
+++ b/Portfolio WP2/8_Unjuk_Kerja Menerapkan Akses Basis Data - Nugraha Jody.docx
@@ -168,13 +168,38 @@
         <w:jc w:val="center"/>
       </w:pPr>
       <w:r>
-        <w:rPr>
-          <w:rFonts w:ascii="Arial" w:hAnsi="Arial"/>
-          <w:b/>
-          <w:color w:val="EF4444"/>
-          <w:sz w:val="22"/>
-        </w:rPr>
-        <w:t>[ TEMPEL SCREENSHOT: KREDENSIAL DATABASE PADA FILE .ENV DI VS CODE DI SINI ]</w:t>
+        <w:drawing>
+          <wp:inline xmlns:a="http://schemas.openxmlformats.org/drawingml/2006/main" xmlns:pic="http://schemas.openxmlformats.org/drawingml/2006/picture">
+            <wp:extent cx="4572000" cy="2352973"/>
+            <wp:docPr id="1" name="Picture 1"/>
+            <wp:cNvGraphicFramePr>
+              <a:graphicFrameLocks noChangeAspect="1"/>
+            </wp:cNvGraphicFramePr>
+            <a:graphic>
+              <a:graphicData uri="http://schemas.openxmlformats.org/drawingml/2006/picture">
+                <pic:pic>
+                  <pic:nvPicPr>
+                    <pic:cNvPr id="0" name="media__1783250706963.png"/>
+                    <pic:cNvPicPr/>
+                  </pic:nvPicPr>
+                  <pic:blipFill>
+                    <a:blip r:embed="rId9"/>
+                    <a:stretch>
+                      <a:fillRect/>
+                    </a:stretch>
+                  </pic:blipFill>
+                  <pic:spPr>
+                    <a:xfrm>
+                      <a:off x="0" y="0"/>
+                      <a:ext cx="4572000" cy="2352973"/>
+                    </a:xfrm>
+                    <a:prstGeom prst="rect"/>
+                  </pic:spPr>
+                </pic:pic>
+              </a:graphicData>
+            </a:graphic>
+          </wp:inline>
+        </w:drawing>
       </w:r>
     </w:p>
     <w:p>
@@ -186,10 +211,10 @@
         <w:rPr>
           <w:rFonts w:ascii="Arial" w:hAnsi="Arial"/>
           <w:i/>
-          <w:color w:val="94A3B8"/>
+          <w:color w:val="64748B"/>
           <w:sz w:val="18"/>
         </w:rPr>
-        <w:t>(Silakan ambil screenshot dari kodingan, terminal, atau phpMyAdmin Anda)</w:t>
+        <w:t>(Screenshot: Kredensial database pada file .env di VS Code)</w:t>
       </w:r>
     </w:p>
     <w:p>
@@ -285,13 +310,38 @@
         <w:jc w:val="center"/>
       </w:pPr>
       <w:r>
-        <w:rPr>
-          <w:rFonts w:ascii="Arial" w:hAnsi="Arial"/>
-          <w:b/>
-          <w:color w:val="EF4444"/>
-          <w:sz w:val="22"/>
-        </w:rPr>
-        <w:t>[ TEMPEL SCREENSHOT: KODINGAN BLUEPRINT SKEMA TABEL USER/BOOKING DI VS CODE DI SINI ]</w:t>
+        <w:drawing>
+          <wp:inline xmlns:a="http://schemas.openxmlformats.org/drawingml/2006/main" xmlns:pic="http://schemas.openxmlformats.org/drawingml/2006/picture">
+            <wp:extent cx="4572000" cy="1178719"/>
+            <wp:docPr id="2" name="Picture 2"/>
+            <wp:cNvGraphicFramePr>
+              <a:graphicFrameLocks noChangeAspect="1"/>
+            </wp:cNvGraphicFramePr>
+            <a:graphic>
+              <a:graphicData uri="http://schemas.openxmlformats.org/drawingml/2006/picture">
+                <pic:pic>
+                  <pic:nvPicPr>
+                    <pic:cNvPr id="0" name="media__1783250878287.png"/>
+                    <pic:cNvPicPr/>
+                  </pic:nvPicPr>
+                  <pic:blipFill>
+                    <a:blip r:embed="rId10"/>
+                    <a:stretch>
+                      <a:fillRect/>
+                    </a:stretch>
+                  </pic:blipFill>
+                  <pic:spPr>
+                    <a:xfrm>
+                      <a:off x="0" y="0"/>
+                      <a:ext cx="4572000" cy="1178719"/>
+                    </a:xfrm>
+                    <a:prstGeom prst="rect"/>
+                  </pic:spPr>
+                </pic:pic>
+              </a:graphicData>
+            </a:graphic>
+          </wp:inline>
+        </w:drawing>
       </w:r>
     </w:p>
     <w:p>
@@ -303,10 +353,10 @@
         <w:rPr>
           <w:rFonts w:ascii="Arial" w:hAnsi="Arial"/>
           <w:i/>
-          <w:color w:val="94A3B8"/>
+          <w:color w:val="64748B"/>
           <w:sz w:val="18"/>
         </w:rPr>
-        <w:t>(Silakan ambil screenshot dari kodingan, terminal, atau phpMyAdmin Anda)</w:t>
+        <w:t>(Screenshot: Kodingan blueprint skema tabel user/booking di VS Code)</w:t>
       </w:r>
     </w:p>
     <w:p>
@@ -402,13 +452,38 @@
         <w:jc w:val="center"/>
       </w:pPr>
       <w:r>
-        <w:rPr>
-          <w:rFonts w:ascii="Arial" w:hAnsi="Arial"/>
-          <w:b/>
-          <w:color w:val="EF4444"/>
-          <w:sz w:val="22"/>
-        </w:rPr>
-        <w:t>[ TEMPEL SCREENSHOT: TERMINAL VS CODE SAAT BERHASIL MENJALANKAN PERINTAH PHP ARTISAN MIGRATE DI SINI ]</w:t>
+        <w:drawing>
+          <wp:inline xmlns:a="http://schemas.openxmlformats.org/drawingml/2006/main" xmlns:pic="http://schemas.openxmlformats.org/drawingml/2006/picture">
+            <wp:extent cx="4572000" cy="2437805"/>
+            <wp:docPr id="3" name="Picture 3"/>
+            <wp:cNvGraphicFramePr>
+              <a:graphicFrameLocks noChangeAspect="1"/>
+            </wp:cNvGraphicFramePr>
+            <a:graphic>
+              <a:graphicData uri="http://schemas.openxmlformats.org/drawingml/2006/picture">
+                <pic:pic>
+                  <pic:nvPicPr>
+                    <pic:cNvPr id="0" name="media__1783250911164.png"/>
+                    <pic:cNvPicPr/>
+                  </pic:nvPicPr>
+                  <pic:blipFill>
+                    <a:blip r:embed="rId11"/>
+                    <a:stretch>
+                      <a:fillRect/>
+                    </a:stretch>
+                  </pic:blipFill>
+                  <pic:spPr>
+                    <a:xfrm>
+                      <a:off x="0" y="0"/>
+                      <a:ext cx="4572000" cy="2437805"/>
+                    </a:xfrm>
+                    <a:prstGeom prst="rect"/>
+                  </pic:spPr>
+                </pic:pic>
+              </a:graphicData>
+            </a:graphic>
+          </wp:inline>
+        </w:drawing>
       </w:r>
     </w:p>
     <w:p>
@@ -420,10 +495,10 @@
         <w:rPr>
           <w:rFonts w:ascii="Arial" w:hAnsi="Arial"/>
           <w:i/>
-          <w:color w:val="94A3B8"/>
+          <w:color w:val="64748B"/>
           <w:sz w:val="18"/>
         </w:rPr>
-        <w:t>(Silakan ambil screenshot dari kodingan, terminal, atau phpMyAdmin Anda)</w:t>
+        <w:t>(Screenshot: Terminal VS Code saat berhasil menjalankan perintah php artisan migrate)</w:t>
       </w:r>
     </w:p>
     <w:p>
@@ -643,7 +718,7 @@
         <w:drawing>
           <wp:inline xmlns:a="http://schemas.openxmlformats.org/drawingml/2006/main" xmlns:pic="http://schemas.openxmlformats.org/drawingml/2006/picture">
             <wp:extent cx="4572000" cy="2455664"/>
-            <wp:docPr id="1" name="Picture 1"/>
+            <wp:docPr id="4" name="Picture 4"/>
             <wp:cNvGraphicFramePr>
               <a:graphicFrameLocks noChangeAspect="1"/>
             </wp:cNvGraphicFramePr>
@@ -651,11 +726,11 @@
               <a:graphicData uri="http://schemas.openxmlformats.org/drawingml/2006/picture">
                 <pic:pic>
                   <pic:nvPicPr>
-                    <pic:cNvPr id="0" name="media__1783247474880.png"/>
+                    <pic:cNvPr id="0" name="media__1783250981344.png"/>
                     <pic:cNvPicPr/>
                   </pic:nvPicPr>
                   <pic:blipFill>
-                    <a:blip r:embed="rId9"/>
+                    <a:blip r:embed="rId12"/>
                     <a:stretch>
                       <a:fillRect/>
                     </a:stretch>
@@ -788,13 +863,38 @@
         <w:jc w:val="center"/>
       </w:pPr>
       <w:r>
-        <w:rPr>
-          <w:rFonts w:ascii="Arial" w:hAnsi="Arial"/>
-          <w:b/>
-          <w:color w:val="EF4444"/>
-          <w:sz w:val="22"/>
-        </w:rPr>
-        <w:t>[ TEMPEL SCREENSHOT: FILE KODINGAN USERSEEDER.PHP DI EDITOR VS CODE DI SINI ]</w:t>
+        <w:drawing>
+          <wp:inline xmlns:a="http://schemas.openxmlformats.org/drawingml/2006/main" xmlns:pic="http://schemas.openxmlformats.org/drawingml/2006/picture">
+            <wp:extent cx="4572000" cy="2437805"/>
+            <wp:docPr id="5" name="Picture 5"/>
+            <wp:cNvGraphicFramePr>
+              <a:graphicFrameLocks noChangeAspect="1"/>
+            </wp:cNvGraphicFramePr>
+            <a:graphic>
+              <a:graphicData uri="http://schemas.openxmlformats.org/drawingml/2006/picture">
+                <pic:pic>
+                  <pic:nvPicPr>
+                    <pic:cNvPr id="0" name="media__1783251015277.png"/>
+                    <pic:cNvPicPr/>
+                  </pic:nvPicPr>
+                  <pic:blipFill>
+                    <a:blip r:embed="rId13"/>
+                    <a:stretch>
+                      <a:fillRect/>
+                    </a:stretch>
+                  </pic:blipFill>
+                  <pic:spPr>
+                    <a:xfrm>
+                      <a:off x="0" y="0"/>
+                      <a:ext cx="4572000" cy="2437805"/>
+                    </a:xfrm>
+                    <a:prstGeom prst="rect"/>
+                  </pic:spPr>
+                </pic:pic>
+              </a:graphicData>
+            </a:graphic>
+          </wp:inline>
+        </w:drawing>
       </w:r>
     </w:p>
     <w:p>
@@ -806,10 +906,10 @@
         <w:rPr>
           <w:rFonts w:ascii="Arial" w:hAnsi="Arial"/>
           <w:i/>
-          <w:color w:val="94A3B8"/>
+          <w:color w:val="64748B"/>
           <w:sz w:val="18"/>
         </w:rPr>
-        <w:t>(Silakan ambil screenshot dari kodingan, terminal, atau phpMyAdmin Anda)</w:t>
+        <w:t>(Screenshot: File kodingan UserSeeder.php di editor VS Code)</w:t>
       </w:r>
     </w:p>
     <w:p>

</xml_diff>

<commit_message>
Embed all remaining screenshots into Task 8 Word report document (Task 8 Complete!)
</commit_message>
<xml_diff>
--- a/Portfolio WP2/8_Unjuk_Kerja Menerapkan Akses Basis Data - Nugraha Jody.docx
+++ b/Portfolio WP2/8_Unjuk_Kerja Menerapkan Akses Basis Data - Nugraha Jody.docx
@@ -594,13 +594,38 @@
         <w:jc w:val="center"/>
       </w:pPr>
       <w:r>
-        <w:rPr>
-          <w:rFonts w:ascii="Arial" w:hAnsi="Arial"/>
-          <w:b/>
-          <w:color w:val="EF4444"/>
-          <w:sz w:val="22"/>
-        </w:rPr>
-        <w:t>[ TEMPEL SCREENSHOT: HALAMAN PHPMYADMIN MENUNJUKKAN DAFTAR TABEL DARI DATABASE BENGKEL_MOTOR DI SINI ]</w:t>
+        <w:drawing>
+          <wp:inline xmlns:a="http://schemas.openxmlformats.org/drawingml/2006/main" xmlns:pic="http://schemas.openxmlformats.org/drawingml/2006/picture">
+            <wp:extent cx="4572000" cy="2428875"/>
+            <wp:docPr id="4" name="Picture 4"/>
+            <wp:cNvGraphicFramePr>
+              <a:graphicFrameLocks noChangeAspect="1"/>
+            </wp:cNvGraphicFramePr>
+            <a:graphic>
+              <a:graphicData uri="http://schemas.openxmlformats.org/drawingml/2006/picture">
+                <pic:pic>
+                  <pic:nvPicPr>
+                    <pic:cNvPr id="0" name="media__1783251112262.png"/>
+                    <pic:cNvPicPr/>
+                  </pic:nvPicPr>
+                  <pic:blipFill>
+                    <a:blip r:embed="rId12"/>
+                    <a:stretch>
+                      <a:fillRect/>
+                    </a:stretch>
+                  </pic:blipFill>
+                  <pic:spPr>
+                    <a:xfrm>
+                      <a:off x="0" y="0"/>
+                      <a:ext cx="4572000" cy="2428875"/>
+                    </a:xfrm>
+                    <a:prstGeom prst="rect"/>
+                  </pic:spPr>
+                </pic:pic>
+              </a:graphicData>
+            </a:graphic>
+          </wp:inline>
+        </w:drawing>
       </w:r>
     </w:p>
     <w:p>
@@ -612,10 +637,10 @@
         <w:rPr>
           <w:rFonts w:ascii="Arial" w:hAnsi="Arial"/>
           <w:i/>
-          <w:color w:val="94A3B8"/>
+          <w:color w:val="64748B"/>
           <w:sz w:val="18"/>
         </w:rPr>
-        <w:t>(Silakan ambil screenshot dari kodingan, terminal, atau phpMyAdmin Anda)</w:t>
+        <w:t>(Screenshot: Halaman phpMyAdmin menunjukkan daftar tabel dari database bengkel_motor)</w:t>
       </w:r>
     </w:p>
     <w:p>
@@ -718,7 +743,7 @@
         <w:drawing>
           <wp:inline xmlns:a="http://schemas.openxmlformats.org/drawingml/2006/main" xmlns:pic="http://schemas.openxmlformats.org/drawingml/2006/picture">
             <wp:extent cx="4572000" cy="2455664"/>
-            <wp:docPr id="4" name="Picture 4"/>
+            <wp:docPr id="5" name="Picture 5"/>
             <wp:cNvGraphicFramePr>
               <a:graphicFrameLocks noChangeAspect="1"/>
             </wp:cNvGraphicFramePr>
@@ -730,7 +755,7 @@
                     <pic:cNvPicPr/>
                   </pic:nvPicPr>
                   <pic:blipFill>
-                    <a:blip r:embed="rId12"/>
+                    <a:blip r:embed="rId13"/>
                     <a:stretch>
                       <a:fillRect/>
                     </a:stretch>
@@ -866,7 +891,7 @@
         <w:drawing>
           <wp:inline xmlns:a="http://schemas.openxmlformats.org/drawingml/2006/main" xmlns:pic="http://schemas.openxmlformats.org/drawingml/2006/picture">
             <wp:extent cx="4572000" cy="2437805"/>
-            <wp:docPr id="5" name="Picture 5"/>
+            <wp:docPr id="6" name="Picture 6"/>
             <wp:cNvGraphicFramePr>
               <a:graphicFrameLocks noChangeAspect="1"/>
             </wp:cNvGraphicFramePr>
@@ -878,7 +903,7 @@
                     <pic:cNvPicPr/>
                   </pic:nvPicPr>
                   <pic:blipFill>
-                    <a:blip r:embed="rId13"/>
+                    <a:blip r:embed="rId14"/>
                     <a:stretch>
                       <a:fillRect/>
                     </a:stretch>
@@ -1005,13 +1030,38 @@
         <w:jc w:val="center"/>
       </w:pPr>
       <w:r>
-        <w:rPr>
-          <w:rFonts w:ascii="Arial" w:hAnsi="Arial"/>
-          <w:b/>
-          <w:color w:val="EF4444"/>
-          <w:sz w:val="22"/>
-        </w:rPr>
-        <w:t>[ TEMPEL SCREENSHOT: TERMINAL VS CODE SAAT BERHASIL MENJALANKAN PERINTAH PHP ARTISAN DB:SEED --CLASS=USERSEEDER DI SINI ]</w:t>
+        <w:drawing>
+          <wp:inline xmlns:a="http://schemas.openxmlformats.org/drawingml/2006/main" xmlns:pic="http://schemas.openxmlformats.org/drawingml/2006/picture">
+            <wp:extent cx="4572000" cy="2428875"/>
+            <wp:docPr id="7" name="Picture 7"/>
+            <wp:cNvGraphicFramePr>
+              <a:graphicFrameLocks noChangeAspect="1"/>
+            </wp:cNvGraphicFramePr>
+            <a:graphic>
+              <a:graphicData uri="http://schemas.openxmlformats.org/drawingml/2006/picture">
+                <pic:pic>
+                  <pic:nvPicPr>
+                    <pic:cNvPr id="0" name="media__1783251091616.png"/>
+                    <pic:cNvPicPr/>
+                  </pic:nvPicPr>
+                  <pic:blipFill>
+                    <a:blip r:embed="rId15"/>
+                    <a:stretch>
+                      <a:fillRect/>
+                    </a:stretch>
+                  </pic:blipFill>
+                  <pic:spPr>
+                    <a:xfrm>
+                      <a:off x="0" y="0"/>
+                      <a:ext cx="4572000" cy="2428875"/>
+                    </a:xfrm>
+                    <a:prstGeom prst="rect"/>
+                  </pic:spPr>
+                </pic:pic>
+              </a:graphicData>
+            </a:graphic>
+          </wp:inline>
+        </w:drawing>
       </w:r>
     </w:p>
     <w:p>
@@ -1023,10 +1073,10 @@
         <w:rPr>
           <w:rFonts w:ascii="Arial" w:hAnsi="Arial"/>
           <w:i/>
-          <w:color w:val="94A3B8"/>
+          <w:color w:val="64748B"/>
           <w:sz w:val="18"/>
         </w:rPr>
-        <w:t>(Silakan ambil screenshot dari kodingan, terminal, atau phpMyAdmin Anda)</w:t>
+        <w:t>(Screenshot: Terminal VS Code saat berhasil menjalankan perintah php artisan db:seed --class=UserSeeder)</w:t>
       </w:r>
     </w:p>
     <w:p>
@@ -1122,13 +1172,38 @@
         <w:jc w:val="center"/>
       </w:pPr>
       <w:r>
-        <w:rPr>
-          <w:rFonts w:ascii="Arial" w:hAnsi="Arial"/>
-          <w:b/>
-          <w:color w:val="EF4444"/>
-          <w:sz w:val="22"/>
-        </w:rPr>
-        <w:t>[ TEMPEL SCREENSHOT: HALAMAN PHPMYADMIN MENUNJUKKAN ISI TABEL USERS YANG SUDAH TERISI DATA SEEDER DI SINI ]</w:t>
+        <w:drawing>
+          <wp:inline xmlns:a="http://schemas.openxmlformats.org/drawingml/2006/main" xmlns:pic="http://schemas.openxmlformats.org/drawingml/2006/picture">
+            <wp:extent cx="4572000" cy="2437805"/>
+            <wp:docPr id="8" name="Picture 8"/>
+            <wp:cNvGraphicFramePr>
+              <a:graphicFrameLocks noChangeAspect="1"/>
+            </wp:cNvGraphicFramePr>
+            <a:graphic>
+              <a:graphicData uri="http://schemas.openxmlformats.org/drawingml/2006/picture">
+                <pic:pic>
+                  <pic:nvPicPr>
+                    <pic:cNvPr id="0" name="media__1783251126575.png"/>
+                    <pic:cNvPicPr/>
+                  </pic:nvPicPr>
+                  <pic:blipFill>
+                    <a:blip r:embed="rId16"/>
+                    <a:stretch>
+                      <a:fillRect/>
+                    </a:stretch>
+                  </pic:blipFill>
+                  <pic:spPr>
+                    <a:xfrm>
+                      <a:off x="0" y="0"/>
+                      <a:ext cx="4572000" cy="2437805"/>
+                    </a:xfrm>
+                    <a:prstGeom prst="rect"/>
+                  </pic:spPr>
+                </pic:pic>
+              </a:graphicData>
+            </a:graphic>
+          </wp:inline>
+        </w:drawing>
       </w:r>
     </w:p>
     <w:p>
@@ -1140,10 +1215,10 @@
         <w:rPr>
           <w:rFonts w:ascii="Arial" w:hAnsi="Arial"/>
           <w:i/>
-          <w:color w:val="94A3B8"/>
+          <w:color w:val="64748B"/>
           <w:sz w:val="18"/>
         </w:rPr>
-        <w:t>(Silakan ambil screenshot dari kodingan, terminal, atau phpMyAdmin Anda)</w:t>
+        <w:t>(Screenshot: Halaman phpMyAdmin menunjukkan isi tabel users yang sudah terisi data seeder)</w:t>
       </w:r>
     </w:p>
     <w:sectPr>

</xml_diff>